<commit_message>
feat: modul akademik & otomasi tagihan (Fase 1-4)
- Tambah modul Akademik: tahun ajaran, jenjang, tingkat, jurusan, ruangan, kelas, pendaftaran siswa

- Tambah modul Keuangan lanjutan: skema biaya, tagihan otomatis, diskon & beasiswa, rekonsiliasi

- Migrasi database 0018-0024: tabel akademik, fee_structures, families, invoices, discounts, payments_v2, RLS

- Tambah features/: akademik, billing, discount, fee-structure, payment-v2 (service + schema)

- Update rbac.ts, nav.ts, types.ts, database.types.ts

- Tambah PRD Otomasi Tagihan sebagai referensi
</commit_message>
<xml_diff>
--- a/PRD-Otomasi-Tagihan-ERP-Sekolah.docx
+++ b/PRD-Otomasi-Tagihan-ERP-Sekolah.docx
@@ -142,12 +142,6 @@
         <w:gridCol w:w="3600"/>
       </w:tblGrid>
       <w:tr>
-        <w:tblPrEx>
-          <w:tblCellMar>
-            <w:top w:w="0" w:type="dxa"/>
-            <w:bottom w:w="0" w:type="dxa"/>
-          </w:tblCellMar>
-        </w:tblPrEx>
         <w:trPr>
           <w:jc w:val="center"/>
         </w:trPr>
@@ -201,12 +195,6 @@
         </w:tc>
       </w:tr>
       <w:tr>
-        <w:tblPrEx>
-          <w:tblCellMar>
-            <w:top w:w="0" w:type="dxa"/>
-            <w:bottom w:w="0" w:type="dxa"/>
-          </w:tblCellMar>
-        </w:tblPrEx>
         <w:trPr>
           <w:jc w:val="center"/>
         </w:trPr>
@@ -250,12 +238,6 @@
         </w:tc>
       </w:tr>
       <w:tr>
-        <w:tblPrEx>
-          <w:tblCellMar>
-            <w:top w:w="0" w:type="dxa"/>
-            <w:bottom w:w="0" w:type="dxa"/>
-          </w:tblCellMar>
-        </w:tblPrEx>
         <w:trPr>
           <w:jc w:val="center"/>
         </w:trPr>
@@ -299,12 +281,6 @@
         </w:tc>
       </w:tr>
       <w:tr>
-        <w:tblPrEx>
-          <w:tblCellMar>
-            <w:top w:w="0" w:type="dxa"/>
-            <w:bottom w:w="0" w:type="dxa"/>
-          </w:tblCellMar>
-        </w:tblPrEx>
         <w:trPr>
           <w:jc w:val="center"/>
         </w:trPr>
@@ -371,12 +347,6 @@
         </w:tc>
       </w:tr>
       <w:tr>
-        <w:tblPrEx>
-          <w:tblCellMar>
-            <w:top w:w="0" w:type="dxa"/>
-            <w:bottom w:w="0" w:type="dxa"/>
-          </w:tblCellMar>
-        </w:tblPrEx>
         <w:trPr>
           <w:jc w:val="center"/>
         </w:trPr>
@@ -1894,12 +1864,6 @@
         <w:gridCol w:w="3050"/>
       </w:tblGrid>
       <w:tr>
-        <w:tblPrEx>
-          <w:tblCellMar>
-            <w:top w:w="0" w:type="dxa"/>
-            <w:bottom w:w="0" w:type="dxa"/>
-          </w:tblCellMar>
-        </w:tblPrEx>
         <w:trPr>
           <w:tblHeader/>
         </w:trPr>
@@ -1983,12 +1947,6 @@
         </w:tc>
       </w:tr>
       <w:tr>
-        <w:tblPrEx>
-          <w:tblCellMar>
-            <w:top w:w="0" w:type="dxa"/>
-            <w:bottom w:w="0" w:type="dxa"/>
-          </w:tblCellMar>
-        </w:tblPrEx>
         <w:tc>
           <w:tcPr>
             <w:tcW w:w="3200" w:type="dxa"/>
@@ -2092,12 +2050,6 @@
         </w:tc>
       </w:tr>
       <w:tr>
-        <w:tblPrEx>
-          <w:tblCellMar>
-            <w:top w:w="0" w:type="dxa"/>
-            <w:bottom w:w="0" w:type="dxa"/>
-          </w:tblCellMar>
-        </w:tblPrEx>
         <w:tc>
           <w:tcPr>
             <w:tcW w:w="3200" w:type="dxa"/>
@@ -2173,12 +2125,6 @@
         </w:tc>
       </w:tr>
       <w:tr>
-        <w:tblPrEx>
-          <w:tblCellMar>
-            <w:top w:w="0" w:type="dxa"/>
-            <w:bottom w:w="0" w:type="dxa"/>
-          </w:tblCellMar>
-        </w:tblPrEx>
         <w:tc>
           <w:tcPr>
             <w:tcW w:w="3200" w:type="dxa"/>
@@ -2273,12 +2219,6 @@
         </w:tc>
       </w:tr>
       <w:tr>
-        <w:tblPrEx>
-          <w:tblCellMar>
-            <w:top w:w="0" w:type="dxa"/>
-            <w:bottom w:w="0" w:type="dxa"/>
-          </w:tblCellMar>
-        </w:tblPrEx>
         <w:tc>
           <w:tcPr>
             <w:tcW w:w="3200" w:type="dxa"/>
@@ -3254,12 +3194,6 @@
         <w:gridCol w:w="6150"/>
       </w:tblGrid>
       <w:tr>
-        <w:tblPrEx>
-          <w:tblCellMar>
-            <w:top w:w="0" w:type="dxa"/>
-            <w:bottom w:w="0" w:type="dxa"/>
-          </w:tblCellMar>
-        </w:tblPrEx>
         <w:trPr>
           <w:tblHeader/>
         </w:trPr>
@@ -3319,12 +3253,6 @@
         </w:tc>
       </w:tr>
       <w:tr>
-        <w:tblPrEx>
-          <w:tblCellMar>
-            <w:top w:w="0" w:type="dxa"/>
-            <w:bottom w:w="0" w:type="dxa"/>
-          </w:tblCellMar>
-        </w:tblPrEx>
         <w:tc>
           <w:tcPr>
             <w:tcW w:w="3200" w:type="dxa"/>
@@ -3420,12 +3348,6 @@
         </w:tc>
       </w:tr>
       <w:tr>
-        <w:tblPrEx>
-          <w:tblCellMar>
-            <w:top w:w="0" w:type="dxa"/>
-            <w:bottom w:w="0" w:type="dxa"/>
-          </w:tblCellMar>
-        </w:tblPrEx>
         <w:tc>
           <w:tcPr>
             <w:tcW w:w="3200" w:type="dxa"/>
@@ -3518,12 +3440,6 @@
         </w:tc>
       </w:tr>
       <w:tr>
-        <w:tblPrEx>
-          <w:tblCellMar>
-            <w:top w:w="0" w:type="dxa"/>
-            <w:bottom w:w="0" w:type="dxa"/>
-          </w:tblCellMar>
-        </w:tblPrEx>
         <w:tc>
           <w:tcPr>
             <w:tcW w:w="3200" w:type="dxa"/>
@@ -3616,12 +3532,6 @@
         </w:tc>
       </w:tr>
       <w:tr>
-        <w:tblPrEx>
-          <w:tblCellMar>
-            <w:top w:w="0" w:type="dxa"/>
-            <w:bottom w:w="0" w:type="dxa"/>
-          </w:tblCellMar>
-        </w:tblPrEx>
         <w:tc>
           <w:tcPr>
             <w:tcW w:w="3200" w:type="dxa"/>
@@ -3725,12 +3635,6 @@
         </w:tc>
       </w:tr>
       <w:tr>
-        <w:tblPrEx>
-          <w:tblCellMar>
-            <w:top w:w="0" w:type="dxa"/>
-            <w:bottom w:w="0" w:type="dxa"/>
-          </w:tblCellMar>
-        </w:tblPrEx>
         <w:tc>
           <w:tcPr>
             <w:tcW w:w="3200" w:type="dxa"/>
@@ -6513,12 +6417,6 @@
         <w:gridCol w:w="2000"/>
       </w:tblGrid>
       <w:tr>
-        <w:tblPrEx>
-          <w:tblCellMar>
-            <w:top w:w="0" w:type="dxa"/>
-            <w:bottom w:w="0" w:type="dxa"/>
-          </w:tblCellMar>
-        </w:tblPrEx>
         <w:trPr>
           <w:tblHeader/>
         </w:trPr>
@@ -6638,12 +6536,6 @@
         </w:tc>
       </w:tr>
       <w:tr>
-        <w:tblPrEx>
-          <w:tblCellMar>
-            <w:top w:w="0" w:type="dxa"/>
-            <w:bottom w:w="0" w:type="dxa"/>
-          </w:tblCellMar>
-        </w:tblPrEx>
         <w:tc>
           <w:tcPr>
             <w:tcW w:w="500" w:type="dxa"/>
@@ -6813,12 +6705,6 @@
         </w:tc>
       </w:tr>
       <w:tr>
-        <w:tblPrEx>
-          <w:tblCellMar>
-            <w:top w:w="0" w:type="dxa"/>
-            <w:bottom w:w="0" w:type="dxa"/>
-          </w:tblCellMar>
-        </w:tblPrEx>
         <w:tc>
           <w:tcPr>
             <w:tcW w:w="500" w:type="dxa"/>
@@ -7030,12 +6916,6 @@
         </w:tc>
       </w:tr>
       <w:tr>
-        <w:tblPrEx>
-          <w:tblCellMar>
-            <w:top w:w="0" w:type="dxa"/>
-            <w:bottom w:w="0" w:type="dxa"/>
-          </w:tblCellMar>
-        </w:tblPrEx>
         <w:tc>
           <w:tcPr>
             <w:tcW w:w="500" w:type="dxa"/>
@@ -7200,12 +7080,6 @@
         </w:tc>
       </w:tr>
       <w:tr>
-        <w:tblPrEx>
-          <w:tblCellMar>
-            <w:top w:w="0" w:type="dxa"/>
-            <w:bottom w:w="0" w:type="dxa"/>
-          </w:tblCellMar>
-        </w:tblPrEx>
         <w:tc>
           <w:tcPr>
             <w:tcW w:w="500" w:type="dxa"/>
@@ -7388,12 +7262,6 @@
         </w:tc>
       </w:tr>
       <w:tr>
-        <w:tblPrEx>
-          <w:tblCellMar>
-            <w:top w:w="0" w:type="dxa"/>
-            <w:bottom w:w="0" w:type="dxa"/>
-          </w:tblCellMar>
-        </w:tblPrEx>
         <w:tc>
           <w:tcPr>
             <w:tcW w:w="500" w:type="dxa"/>
@@ -7549,12 +7417,6 @@
         </w:tc>
       </w:tr>
       <w:tr>
-        <w:tblPrEx>
-          <w:tblCellMar>
-            <w:top w:w="0" w:type="dxa"/>
-            <w:bottom w:w="0" w:type="dxa"/>
-          </w:tblCellMar>
-        </w:tblPrEx>
         <w:tc>
           <w:tcPr>
             <w:tcW w:w="500" w:type="dxa"/>
@@ -7766,12 +7628,6 @@
         </w:tc>
       </w:tr>
       <w:tr>
-        <w:tblPrEx>
-          <w:tblCellMar>
-            <w:top w:w="0" w:type="dxa"/>
-            <w:bottom w:w="0" w:type="dxa"/>
-          </w:tblCellMar>
-        </w:tblPrEx>
         <w:tc>
           <w:tcPr>
             <w:tcW w:w="500" w:type="dxa"/>
@@ -7959,12 +7815,6 @@
         </w:tc>
       </w:tr>
       <w:tr>
-        <w:tblPrEx>
-          <w:tblCellMar>
-            <w:top w:w="0" w:type="dxa"/>
-            <w:bottom w:w="0" w:type="dxa"/>
-          </w:tblCellMar>
-        </w:tblPrEx>
         <w:tc>
           <w:tcPr>
             <w:tcW w:w="500" w:type="dxa"/>
@@ -8117,12 +7967,6 @@
         </w:tc>
       </w:tr>
       <w:tr>
-        <w:tblPrEx>
-          <w:tblCellMar>
-            <w:top w:w="0" w:type="dxa"/>
-            <w:bottom w:w="0" w:type="dxa"/>
-          </w:tblCellMar>
-        </w:tblPrEx>
         <w:tc>
           <w:tcPr>
             <w:tcW w:w="500" w:type="dxa"/>
@@ -8283,12 +8127,6 @@
         </w:tc>
       </w:tr>
       <w:tr>
-        <w:tblPrEx>
-          <w:tblCellMar>
-            <w:top w:w="0" w:type="dxa"/>
-            <w:bottom w:w="0" w:type="dxa"/>
-          </w:tblCellMar>
-        </w:tblPrEx>
         <w:tc>
           <w:tcPr>
             <w:tcW w:w="500" w:type="dxa"/>
@@ -8415,12 +8253,6 @@
         </w:tc>
       </w:tr>
       <w:tr>
-        <w:tblPrEx>
-          <w:tblCellMar>
-            <w:top w:w="0" w:type="dxa"/>
-            <w:bottom w:w="0" w:type="dxa"/>
-          </w:tblCellMar>
-        </w:tblPrEx>
         <w:tc>
           <w:tcPr>
             <w:tcW w:w="500" w:type="dxa"/>
@@ -8584,12 +8416,6 @@
         </w:tc>
       </w:tr>
       <w:tr>
-        <w:tblPrEx>
-          <w:tblCellMar>
-            <w:top w:w="0" w:type="dxa"/>
-            <w:bottom w:w="0" w:type="dxa"/>
-          </w:tblCellMar>
-        </w:tblPrEx>
         <w:tc>
           <w:tcPr>
             <w:tcW w:w="500" w:type="dxa"/>
@@ -8820,12 +8646,6 @@
         </w:tc>
       </w:tr>
       <w:tr>
-        <w:tblPrEx>
-          <w:tblCellMar>
-            <w:top w:w="0" w:type="dxa"/>
-            <w:bottom w:w="0" w:type="dxa"/>
-          </w:tblCellMar>
-        </w:tblPrEx>
         <w:tc>
           <w:tcPr>
             <w:tcW w:w="500" w:type="dxa"/>
@@ -9023,12 +8843,6 @@
         </w:tc>
       </w:tr>
       <w:tr>
-        <w:tblPrEx>
-          <w:tblCellMar>
-            <w:top w:w="0" w:type="dxa"/>
-            <w:bottom w:w="0" w:type="dxa"/>
-          </w:tblCellMar>
-        </w:tblPrEx>
         <w:tc>
           <w:tcPr>
             <w:tcW w:w="500" w:type="dxa"/>
@@ -9305,12 +9119,6 @@
         <w:gridCol w:w="6750"/>
       </w:tblGrid>
       <w:tr>
-        <w:tblPrEx>
-          <w:tblCellMar>
-            <w:top w:w="0" w:type="dxa"/>
-            <w:bottom w:w="0" w:type="dxa"/>
-          </w:tblCellMar>
-        </w:tblPrEx>
         <w:trPr>
           <w:tblHeader/>
         </w:trPr>
@@ -9372,12 +9180,6 @@
         </w:tc>
       </w:tr>
       <w:tr>
-        <w:tblPrEx>
-          <w:tblCellMar>
-            <w:top w:w="0" w:type="dxa"/>
-            <w:bottom w:w="0" w:type="dxa"/>
-          </w:tblCellMar>
-        </w:tblPrEx>
         <w:tc>
           <w:tcPr>
             <w:tcW w:w="2600" w:type="dxa"/>
@@ -9430,12 +9232,6 @@
         </w:tc>
       </w:tr>
       <w:tr>
-        <w:tblPrEx>
-          <w:tblCellMar>
-            <w:top w:w="0" w:type="dxa"/>
-            <w:bottom w:w="0" w:type="dxa"/>
-          </w:tblCellMar>
-        </w:tblPrEx>
         <w:tc>
           <w:tcPr>
             <w:tcW w:w="2600" w:type="dxa"/>
@@ -9473,12 +9269,6 @@
         </w:tc>
       </w:tr>
       <w:tr>
-        <w:tblPrEx>
-          <w:tblCellMar>
-            <w:top w:w="0" w:type="dxa"/>
-            <w:bottom w:w="0" w:type="dxa"/>
-          </w:tblCellMar>
-        </w:tblPrEx>
         <w:tc>
           <w:tcPr>
             <w:tcW w:w="2600" w:type="dxa"/>
@@ -9541,12 +9331,6 @@
         </w:tc>
       </w:tr>
       <w:tr>
-        <w:tblPrEx>
-          <w:tblCellMar>
-            <w:top w:w="0" w:type="dxa"/>
-            <w:bottom w:w="0" w:type="dxa"/>
-          </w:tblCellMar>
-        </w:tblPrEx>
         <w:tc>
           <w:tcPr>
             <w:tcW w:w="2600" w:type="dxa"/>
@@ -9604,12 +9388,6 @@
         </w:tc>
       </w:tr>
       <w:tr>
-        <w:tblPrEx>
-          <w:tblCellMar>
-            <w:top w:w="0" w:type="dxa"/>
-            <w:bottom w:w="0" w:type="dxa"/>
-          </w:tblCellMar>
-        </w:tblPrEx>
         <w:tc>
           <w:tcPr>
             <w:tcW w:w="2600" w:type="dxa"/>
@@ -9708,12 +9486,6 @@
         <w:gridCol w:w="6750"/>
       </w:tblGrid>
       <w:tr>
-        <w:tblPrEx>
-          <w:tblCellMar>
-            <w:top w:w="0" w:type="dxa"/>
-            <w:bottom w:w="0" w:type="dxa"/>
-          </w:tblCellMar>
-        </w:tblPrEx>
         <w:trPr>
           <w:tblHeader/>
         </w:trPr>
@@ -9767,12 +9539,6 @@
         </w:tc>
       </w:tr>
       <w:tr>
-        <w:tblPrEx>
-          <w:tblCellMar>
-            <w:top w:w="0" w:type="dxa"/>
-            <w:bottom w:w="0" w:type="dxa"/>
-          </w:tblCellMar>
-        </w:tblPrEx>
         <w:tc>
           <w:tcPr>
             <w:tcW w:w="2600" w:type="dxa"/>
@@ -9887,12 +9653,6 @@
         </w:tc>
       </w:tr>
       <w:tr>
-        <w:tblPrEx>
-          <w:tblCellMar>
-            <w:top w:w="0" w:type="dxa"/>
-            <w:bottom w:w="0" w:type="dxa"/>
-          </w:tblCellMar>
-        </w:tblPrEx>
         <w:tc>
           <w:tcPr>
             <w:tcW w:w="2600" w:type="dxa"/>
@@ -9977,12 +9737,6 @@
         </w:tc>
       </w:tr>
       <w:tr>
-        <w:tblPrEx>
-          <w:tblCellMar>
-            <w:top w:w="0" w:type="dxa"/>
-            <w:bottom w:w="0" w:type="dxa"/>
-          </w:tblCellMar>
-        </w:tblPrEx>
         <w:tc>
           <w:tcPr>
             <w:tcW w:w="2600" w:type="dxa"/>
@@ -10094,12 +9848,6 @@
         </w:tc>
       </w:tr>
       <w:tr>
-        <w:tblPrEx>
-          <w:tblCellMar>
-            <w:top w:w="0" w:type="dxa"/>
-            <w:bottom w:w="0" w:type="dxa"/>
-          </w:tblCellMar>
-        </w:tblPrEx>
         <w:tc>
           <w:tcPr>
             <w:tcW w:w="2600" w:type="dxa"/>
@@ -10184,12 +9932,6 @@
         </w:tc>
       </w:tr>
       <w:tr>
-        <w:tblPrEx>
-          <w:tblCellMar>
-            <w:top w:w="0" w:type="dxa"/>
-            <w:bottom w:w="0" w:type="dxa"/>
-          </w:tblCellMar>
-        </w:tblPrEx>
         <w:tc>
           <w:tcPr>
             <w:tcW w:w="2600" w:type="dxa"/>
@@ -10258,12 +10000,6 @@
         </w:tc>
       </w:tr>
       <w:tr>
-        <w:tblPrEx>
-          <w:tblCellMar>
-            <w:top w:w="0" w:type="dxa"/>
-            <w:bottom w:w="0" w:type="dxa"/>
-          </w:tblCellMar>
-        </w:tblPrEx>
         <w:tc>
           <w:tcPr>
             <w:tcW w:w="2600" w:type="dxa"/>
@@ -10800,12 +10536,6 @@
         <w:gridCol w:w="4150"/>
       </w:tblGrid>
       <w:tr>
-        <w:tblPrEx>
-          <w:tblCellMar>
-            <w:top w:w="0" w:type="dxa"/>
-            <w:bottom w:w="0" w:type="dxa"/>
-          </w:tblCellMar>
-        </w:tblPrEx>
         <w:trPr>
           <w:tblHeader/>
         </w:trPr>
@@ -10881,12 +10611,6 @@
         </w:tc>
       </w:tr>
       <w:tr>
-        <w:tblPrEx>
-          <w:tblCellMar>
-            <w:top w:w="0" w:type="dxa"/>
-            <w:bottom w:w="0" w:type="dxa"/>
-          </w:tblCellMar>
-        </w:tblPrEx>
         <w:tc>
           <w:tcPr>
             <w:tcW w:w="2600" w:type="dxa"/>
@@ -11090,12 +10814,6 @@
         </w:tc>
       </w:tr>
       <w:tr>
-        <w:tblPrEx>
-          <w:tblCellMar>
-            <w:top w:w="0" w:type="dxa"/>
-            <w:bottom w:w="0" w:type="dxa"/>
-          </w:tblCellMar>
-        </w:tblPrEx>
         <w:tc>
           <w:tcPr>
             <w:tcW w:w="2600" w:type="dxa"/>
@@ -11230,12 +10948,6 @@
         </w:tc>
       </w:tr>
       <w:tr>
-        <w:tblPrEx>
-          <w:tblCellMar>
-            <w:top w:w="0" w:type="dxa"/>
-            <w:bottom w:w="0" w:type="dxa"/>
-          </w:tblCellMar>
-        </w:tblPrEx>
         <w:tc>
           <w:tcPr>
             <w:tcW w:w="2600" w:type="dxa"/>
@@ -11404,12 +11116,6 @@
         </w:tc>
       </w:tr>
       <w:tr>
-        <w:tblPrEx>
-          <w:tblCellMar>
-            <w:top w:w="0" w:type="dxa"/>
-            <w:bottom w:w="0" w:type="dxa"/>
-          </w:tblCellMar>
-        </w:tblPrEx>
         <w:tc>
           <w:tcPr>
             <w:tcW w:w="2600" w:type="dxa"/>
@@ -11574,12 +11280,6 @@
         <w:gridCol w:w="1800"/>
       </w:tblGrid>
       <w:tr>
-        <w:tblPrEx>
-          <w:tblCellMar>
-            <w:top w:w="0" w:type="dxa"/>
-            <w:bottom w:w="0" w:type="dxa"/>
-          </w:tblCellMar>
-        </w:tblPrEx>
         <w:trPr>
           <w:tblHeader/>
         </w:trPr>
@@ -11655,12 +11355,6 @@
         </w:tc>
       </w:tr>
       <w:tr>
-        <w:tblPrEx>
-          <w:tblCellMar>
-            <w:top w:w="0" w:type="dxa"/>
-            <w:bottom w:w="0" w:type="dxa"/>
-          </w:tblCellMar>
-        </w:tblPrEx>
         <w:tc>
           <w:tcPr>
             <w:tcW w:w="1800" w:type="dxa"/>
@@ -11753,12 +11447,6 @@
         </w:tc>
       </w:tr>
       <w:tr>
-        <w:tblPrEx>
-          <w:tblCellMar>
-            <w:top w:w="0" w:type="dxa"/>
-            <w:bottom w:w="0" w:type="dxa"/>
-          </w:tblCellMar>
-        </w:tblPrEx>
         <w:tc>
           <w:tcPr>
             <w:tcW w:w="1800" w:type="dxa"/>
@@ -11851,12 +11539,6 @@
         </w:tc>
       </w:tr>
       <w:tr>
-        <w:tblPrEx>
-          <w:tblCellMar>
-            <w:top w:w="0" w:type="dxa"/>
-            <w:bottom w:w="0" w:type="dxa"/>
-          </w:tblCellMar>
-        </w:tblPrEx>
         <w:tc>
           <w:tcPr>
             <w:tcW w:w="1800" w:type="dxa"/>
@@ -11941,12 +11623,6 @@
         </w:tc>
       </w:tr>
       <w:tr>
-        <w:tblPrEx>
-          <w:tblCellMar>
-            <w:top w:w="0" w:type="dxa"/>
-            <w:bottom w:w="0" w:type="dxa"/>
-          </w:tblCellMar>
-        </w:tblPrEx>
         <w:tc>
           <w:tcPr>
             <w:tcW w:w="1800" w:type="dxa"/>
@@ -12015,12 +11691,6 @@
         </w:tc>
       </w:tr>
       <w:tr>
-        <w:tblPrEx>
-          <w:tblCellMar>
-            <w:top w:w="0" w:type="dxa"/>
-            <w:bottom w:w="0" w:type="dxa"/>
-          </w:tblCellMar>
-        </w:tblPrEx>
         <w:tc>
           <w:tcPr>
             <w:tcW w:w="1800" w:type="dxa"/>
@@ -12808,7 +12478,7 @@
       </w:pPr>
       <w:r>
         <w:pict w14:anchorId="438692EB">
-          <v:rect id="_x0000_i1061" style="width:0;height:1.5pt" o:hralign="center" o:hrstd="t" o:hr="t" fillcolor="#a0a0a0" stroked="f"/>
+          <v:rect id="_x0000_i1025" style="width:0;height:1.5pt" o:hralign="center" o:hrstd="t" o:hr="t" fillcolor="#a0a0a0" stroked="f"/>
         </w:pict>
       </w:r>
     </w:p>
@@ -16829,7 +16499,7 @@
       <w:r>
         <w:lastRenderedPageBreak/>
         <w:pict w14:anchorId="694D4641">
-          <v:rect id="_x0000_i1063" style="width:0;height:1.5pt" o:hralign="center" o:hrstd="t" o:hr="t" fillcolor="#a0a0a0" stroked="f"/>
+          <v:rect id="_x0000_i1026" style="width:0;height:1.5pt" o:hralign="center" o:hrstd="t" o:hr="t" fillcolor="#a0a0a0" stroked="f"/>
         </w:pict>
       </w:r>
     </w:p>
@@ -19598,7 +19268,7 @@
       </w:pPr>
       <w:r>
         <w:pict w14:anchorId="548D1C14">
-          <v:rect id="_x0000_i1064" style="width:0;height:1.5pt" o:hralign="center" o:hrstd="t" o:hr="t" fillcolor="#a0a0a0" stroked="f"/>
+          <v:rect id="_x0000_i1027" style="width:0;height:1.5pt" o:hralign="center" o:hrstd="t" o:hr="t" fillcolor="#a0a0a0" stroked="f"/>
         </w:pict>
       </w:r>
     </w:p>
@@ -20156,7 +19826,7 @@
       </w:pPr>
       <w:r>
         <w:pict w14:anchorId="447B1DC2">
-          <v:rect id="_x0000_i1065" style="width:0;height:1.5pt" o:hralign="center" o:hrstd="t" o:hr="t" fillcolor="#a0a0a0" stroked="f"/>
+          <v:rect id="_x0000_i1028" style="width:0;height:1.5pt" o:hralign="center" o:hrstd="t" o:hr="t" fillcolor="#a0a0a0" stroked="f"/>
         </w:pict>
       </w:r>
     </w:p>
@@ -22280,7 +21950,7 @@
       </w:pPr>
       <w:r>
         <w:pict w14:anchorId="423163EF">
-          <v:rect id="_x0000_i1066" style="width:0;height:1.5pt" o:hralign="center" o:hrstd="t" o:hr="t" fillcolor="#a0a0a0" stroked="f"/>
+          <v:rect id="_x0000_i1029" style="width:0;height:1.5pt" o:hralign="center" o:hrstd="t" o:hr="t" fillcolor="#a0a0a0" stroked="f"/>
         </w:pict>
       </w:r>
     </w:p>
@@ -24239,6 +23909,7 @@
   <w:style w:type="character" w:default="1" w:styleId="DefaultParagraphFont">
     <w:name w:val="Default Paragraph Font"/>
     <w:uiPriority w:val="1"/>
+    <w:semiHidden/>
     <w:unhideWhenUsed/>
   </w:style>
   <w:style w:type="table" w:default="1" w:styleId="TableNormal">

</xml_diff>